<commit_message>
kursen klar. Tenta skriven.
</commit_message>
<xml_diff>
--- a/_site/EL9.docx
+++ b/_site/EL9.docx
@@ -709,7 +709,7 @@
         <w:rPr>
           <w:rStyle w:val="VerbatimChar"/>
         </w:rPr>
-        <w:t xml:space="preserve"># Code created:  2026-03-18                                               #</w:t>
+        <w:t xml:space="preserve"># Code created:  2026-03-20                                               #</w:t>
       </w:r>
       <w:r>
         <w:br/>
@@ -718,7 +718,7 @@
         <w:rPr>
           <w:rStyle w:val="VerbatimChar"/>
         </w:rPr>
-        <w:t xml:space="preserve"># Last updated:  2026-03-18                                               #</w:t>
+        <w:t xml:space="preserve"># Last updated:  2026-03-20                                               #</w:t>
       </w:r>
       <w:r>
         <w:br/>
@@ -4285,7 +4285,7 @@
         <w:pStyle w:val="BlockText"/>
       </w:pPr>
       <w:r>
-        <w:t xml:space="preserve">Todys date is 2026-03-18 and it is 08 AM</w:t>
+        <w:t xml:space="preserve">Todys date is 2026-03-20 and it is 12 PM</w:t>
       </w:r>
     </w:p>
     <w:p>
@@ -4322,7 +4322,7 @@
           <w:b/>
           <w:bCs/>
         </w:rPr>
-        <w:t xml:space="preserve">2026-03-18</w:t>
+        <w:t xml:space="preserve">2026-03-20</w:t>
       </w:r>
       <w:r>
         <w:t xml:space="preserve"> </w:t>
@@ -4338,7 +4338,7 @@
           <w:i/>
           <w:iCs/>
         </w:rPr>
-        <w:t xml:space="preserve">08 AM</w:t>
+        <w:t xml:space="preserve">12 PM</w:t>
       </w:r>
     </w:p>
     <w:p>

</xml_diff>